<commit_message>
Apostila Básica II de CSharp - Cap5 - Deixando o Site Profissional com Imagens e Bootstrap
Apostila Básica II de CSharp - Cap5 - Deixando o Site Profissional com Imagens e Bootstrap
</commit_message>
<xml_diff>
--- a/Apostilas/Basica II/Apostila Básica II de CSharp - Cap 4 - ViewBag e Razor.docx
+++ b/Apostilas/Basica II/Apostila Básica II de CSharp - Cap 4 - ViewBag e Razor.docx
@@ -3611,2301 +3611,6 @@
           <w:lang w:val="pt-BR"/>
         </w:rPr>
         <w:t>Testem no navegador! Adicionem um novo curso à lista C# no topo do arquivo, salvem, e vejam a mágica acontecer: o HTML vai se adaptar e gerar um novo item na lista automaticamente.</w:t>
-      </w:r>
-    </w:p>
-    <w:p>
-      <w:pPr>
-        <w:pStyle w:val="Ttulo1"/>
-        <w:rPr>
-          <w:noProof/>
-          <w:lang w:val="pt-BR"/>
-        </w:rPr>
-      </w:pPr>
-      <w:r>
-        <w:rPr>
-          <w:noProof/>
-          <w:lang w:val="pt-BR" w:bidi="pt-BR"/>
-        </w:rPr>
-        <w:lastRenderedPageBreak/>
-        <w:t>Adicione efeitos visuais com imagens da Web</w:t>
-      </w:r>
-    </w:p>
-    <w:p>
-      <w:pPr>
-        <w:keepNext/>
-        <w:rPr>
-          <w:noProof/>
-          <w:lang w:val="pt-BR"/>
-        </w:rPr>
-      </w:pPr>
-      <w:r>
-        <w:rPr>
-          <w:noProof/>
-          <w:lang w:val="pt-BR" w:bidi="pt-BR"/>
-        </w:rPr>
-        <w:drawing>
-          <wp:inline distT="0" distB="0" distL="0" distR="0" wp14:anchorId="579662EF" wp14:editId="4F0CD3CC">
-            <wp:extent cx="5743263" cy="2487972"/>
-            <wp:effectExtent l="0" t="0" r="0" b="7620"/>
-            <wp:docPr id="4" name="Imagem 4"/>
-            <wp:cNvGraphicFramePr>
-              <a:graphicFrameLocks xmlns:a="http://schemas.openxmlformats.org/drawingml/2006/main" noChangeAspect="1"/>
-            </wp:cNvGraphicFramePr>
-            <a:graphic xmlns:a="http://schemas.openxmlformats.org/drawingml/2006/main">
-              <a:graphicData uri="http://schemas.openxmlformats.org/drawingml/2006/picture">
-                <pic:pic xmlns:pic="http://schemas.openxmlformats.org/drawingml/2006/picture">
-                  <pic:nvPicPr>
-                    <pic:cNvPr id="1" name=""/>
-                    <pic:cNvPicPr/>
-                  </pic:nvPicPr>
-                  <pic:blipFill>
-                    <a:blip r:embed="rId11"/>
-                    <a:stretch>
-                      <a:fillRect/>
-                    </a:stretch>
-                  </pic:blipFill>
-                  <pic:spPr>
-                    <a:xfrm>
-                      <a:off x="0" y="0"/>
-                      <a:ext cx="5743263" cy="2487972"/>
-                    </a:xfrm>
-                    <a:prstGeom prst="rect">
-                      <a:avLst/>
-                    </a:prstGeom>
-                  </pic:spPr>
-                </pic:pic>
-              </a:graphicData>
-            </a:graphic>
-          </wp:inline>
-        </w:drawing>
-      </w:r>
-    </w:p>
-    <w:p>
-      <w:pPr>
-        <w:rPr>
-          <w:noProof/>
-          <w:lang w:val="pt-BR"/>
-        </w:rPr>
-      </w:pPr>
-      <w:r>
-        <w:rPr>
-          <w:noProof/>
-          <w:lang w:val="pt-BR" w:bidi="pt-BR"/>
-        </w:rPr>
-        <w:t>O Word funciona com o Bing para dar acesso a milhares de imagens que podem ser usadas nos seus documentos.</w:t>
-      </w:r>
-    </w:p>
-    <w:p>
-      <w:pPr>
-        <w:rPr>
-          <w:noProof/>
-          <w:lang w:val="pt-BR"/>
-        </w:rPr>
-      </w:pPr>
-      <w:r>
-        <w:rPr>
-          <w:rStyle w:val="nfase"/>
-          <w:noProof/>
-          <w:lang w:val="pt-BR" w:bidi="pt-BR"/>
-        </w:rPr>
-        <w:t>Experimente:</w:t>
-      </w:r>
-      <w:r>
-        <w:rPr>
-          <w:noProof/>
-          <w:lang w:val="pt-BR" w:bidi="pt-BR"/>
-        </w:rPr>
-        <w:t xml:space="preserve"> pressione Enter após esta linha para criar uma linha em branco:</w:t>
-      </w:r>
-    </w:p>
-    <w:p>
-      <w:pPr>
-        <w:pStyle w:val="Numerada"/>
-        <w:numPr>
-          <w:ilvl w:val="0"/>
-          <w:numId w:val="2"/>
-        </w:numPr>
-        <w:rPr>
-          <w:noProof/>
-          <w:lang w:val="pt-BR"/>
-        </w:rPr>
-      </w:pPr>
-      <w:r>
-        <w:rPr>
-          <w:noProof/>
-          <w:lang w:val="pt-BR" w:bidi="pt-BR"/>
-        </w:rPr>
-        <w:t xml:space="preserve">Com o cursor no espaço em branco acima, vá para a guia Inserir, selecione </w:t>
-      </w:r>
-      <w:r>
-        <w:rPr>
-          <w:rStyle w:val="Forte"/>
-          <w:noProof/>
-          <w:lang w:val="pt-BR" w:bidi="pt-BR"/>
-        </w:rPr>
-        <w:t>Imagens Online</w:t>
-      </w:r>
-      <w:r>
-        <w:rPr>
-          <w:noProof/>
-          <w:lang w:val="pt-BR" w:bidi="pt-BR"/>
-        </w:rPr>
-        <w:t xml:space="preserve"> e procure por algo, como </w:t>
-      </w:r>
-      <w:r>
-        <w:rPr>
-          <w:rStyle w:val="nfaseIntensa"/>
-          <w:noProof/>
-          <w:lang w:val="pt-BR" w:bidi="pt-BR"/>
-        </w:rPr>
-        <w:t>clip-art filhote de cachorro</w:t>
-      </w:r>
-      <w:r>
-        <w:rPr>
-          <w:noProof/>
-          <w:lang w:val="pt-BR" w:bidi="pt-BR"/>
-        </w:rPr>
-        <w:t>.</w:t>
-      </w:r>
-    </w:p>
-    <w:p>
-      <w:pPr>
-        <w:pStyle w:val="Numerada"/>
-        <w:numPr>
-          <w:ilvl w:val="0"/>
-          <w:numId w:val="1"/>
-        </w:numPr>
-        <w:rPr>
-          <w:noProof/>
-          <w:lang w:val="pt-BR"/>
-        </w:rPr>
-      </w:pPr>
-      <w:r>
-        <w:rPr>
-          <w:noProof/>
-          <w:lang w:val="pt-BR" w:bidi="pt-BR"/>
-        </w:rPr>
-        <w:t xml:space="preserve">Selecione a imagem desejada e depois </w:t>
-      </w:r>
-      <w:r>
-        <w:rPr>
-          <w:rStyle w:val="Forte"/>
-          <w:noProof/>
-          <w:lang w:val="pt-BR" w:bidi="pt-BR"/>
-        </w:rPr>
-        <w:t>Inserir</w:t>
-      </w:r>
-      <w:r>
-        <w:rPr>
-          <w:noProof/>
-          <w:lang w:val="pt-BR" w:bidi="pt-BR"/>
-        </w:rPr>
-        <w:t>.</w:t>
-      </w:r>
-    </w:p>
-    <w:p>
-      <w:pPr>
-        <w:pStyle w:val="Ttulo1"/>
-        <w:rPr>
-          <w:noProof/>
-          <w:lang w:val="pt-BR"/>
-        </w:rPr>
-      </w:pPr>
-      <w:r>
-        <w:rPr>
-          <w:noProof/>
-          <w:lang w:val="pt-BR" w:bidi="pt-BR"/>
-        </w:rPr>
-        <w:t>Formate o texto para deixar a sua mensagem mais visual</w:t>
-      </w:r>
-    </w:p>
-    <w:p>
-      <w:pPr>
-        <w:rPr>
-          <w:noProof/>
-          <w:lang w:val="pt-BR"/>
-        </w:rPr>
-      </w:pPr>
-      <w:r>
-        <w:rPr>
-          <w:noProof/>
-          <w:lang w:val="pt-BR" w:bidi="pt-BR"/>
-        </w:rPr>
-        <w:drawing>
-          <wp:inline distT="0" distB="0" distL="0" distR="0" wp14:anchorId="22A42DB6" wp14:editId="548FA917">
-            <wp:extent cx="4502063" cy="809848"/>
-            <wp:effectExtent l="19050" t="19050" r="13335" b="28575"/>
-            <wp:docPr id="24" name="Imagem 24" descr="Exemplo das seções Fonte e Parágrafo da guia Página Inicial"/>
-            <wp:cNvGraphicFramePr>
-              <a:graphicFrameLocks xmlns:a="http://schemas.openxmlformats.org/drawingml/2006/main" noChangeAspect="1"/>
-            </wp:cNvGraphicFramePr>
-            <a:graphic xmlns:a="http://schemas.openxmlformats.org/drawingml/2006/main">
-              <a:graphicData uri="http://schemas.openxmlformats.org/drawingml/2006/picture">
-                <pic:pic xmlns:pic="http://schemas.openxmlformats.org/drawingml/2006/picture">
-                  <pic:nvPicPr>
-                    <pic:cNvPr id="1" name=""/>
-                    <pic:cNvPicPr/>
-                  </pic:nvPicPr>
-                  <pic:blipFill>
-                    <a:blip r:embed="rId12"/>
-                    <a:stretch>
-                      <a:fillRect/>
-                    </a:stretch>
-                  </pic:blipFill>
-                  <pic:spPr>
-                    <a:xfrm>
-                      <a:off x="0" y="0"/>
-                      <a:ext cx="4502063" cy="809848"/>
-                    </a:xfrm>
-                    <a:prstGeom prst="rect">
-                      <a:avLst/>
-                    </a:prstGeom>
-                    <a:ln w="3175">
-                      <a:solidFill>
-                        <a:schemeClr val="accent1">
-                          <a:lumMod val="50000"/>
-                        </a:schemeClr>
-                      </a:solidFill>
-                    </a:ln>
-                  </pic:spPr>
-                </pic:pic>
-              </a:graphicData>
-            </a:graphic>
-          </wp:inline>
-        </w:drawing>
-      </w:r>
-    </w:p>
-    <w:p>
-      <w:pPr>
-        <w:rPr>
-          <w:noProof/>
-          <w:lang w:val="pt-BR"/>
-        </w:rPr>
-      </w:pPr>
-      <w:r>
-        <w:rPr>
-          <w:noProof/>
-          <w:lang w:val="pt-BR" w:bidi="pt-BR"/>
-        </w:rPr>
-        <w:t xml:space="preserve">Para formatar, selecione o texto e depois um botão na área </w:t>
-      </w:r>
-      <w:r>
-        <w:rPr>
-          <w:rStyle w:val="Forte"/>
-          <w:noProof/>
-          <w:lang w:val="pt-BR" w:bidi="pt-BR"/>
-        </w:rPr>
-        <w:t>Fonte</w:t>
-      </w:r>
-      <w:r>
-        <w:rPr>
-          <w:noProof/>
-          <w:lang w:val="pt-BR" w:bidi="pt-BR"/>
-        </w:rPr>
-        <w:t xml:space="preserve"> ou </w:t>
-      </w:r>
-      <w:r>
-        <w:rPr>
-          <w:rStyle w:val="Forte"/>
-          <w:noProof/>
-          <w:lang w:val="pt-BR" w:bidi="pt-BR"/>
-        </w:rPr>
-        <w:t>Parágrafo</w:t>
-      </w:r>
-      <w:r>
-        <w:rPr>
-          <w:noProof/>
-          <w:lang w:val="pt-BR" w:bidi="pt-BR"/>
-        </w:rPr>
-        <w:t xml:space="preserve"> na guia Página Inicial.</w:t>
-      </w:r>
-    </w:p>
-    <w:p>
-      <w:pPr>
-        <w:rPr>
-          <w:noProof/>
-          <w:lang w:val="pt-BR"/>
-        </w:rPr>
-      </w:pPr>
-      <w:r>
-        <w:rPr>
-          <w:rStyle w:val="nfase"/>
-          <w:noProof/>
-          <w:lang w:val="pt-BR" w:bidi="pt-BR"/>
-        </w:rPr>
-        <w:t>Experimente:</w:t>
-      </w:r>
-      <w:r>
-        <w:rPr>
-          <w:noProof/>
-          <w:lang w:val="pt-BR" w:bidi="pt-BR"/>
-        </w:rPr>
-        <w:t xml:space="preserve"> selecione o texto nas linhas abaixo e escolha as opções de formatação de modo que ele seja um exemplo da formatação que descreve:</w:t>
-      </w:r>
-    </w:p>
-    <w:tbl>
-      <w:tblPr>
-        <w:tblStyle w:val="Tabelacomgrade"/>
-        <w:tblW w:w="5000" w:type="pct"/>
-        <w:tblBorders>
-          <w:top w:val="none" w:sz="0" w:space="0" w:color="auto"/>
-          <w:left w:val="none" w:sz="0" w:space="0" w:color="auto"/>
-          <w:bottom w:val="none" w:sz="0" w:space="0" w:color="auto"/>
-          <w:right w:val="none" w:sz="0" w:space="0" w:color="auto"/>
-          <w:insideH w:val="none" w:sz="0" w:space="0" w:color="auto"/>
-          <w:insideV w:val="none" w:sz="0" w:space="0" w:color="auto"/>
-        </w:tblBorders>
-        <w:tblLayout w:type="fixed"/>
-        <w:tblCellMar>
-          <w:left w:w="0" w:type="dxa"/>
-          <w:right w:w="0" w:type="dxa"/>
-        </w:tblCellMar>
-        <w:tblLook w:val="04A0" w:firstRow="1" w:lastRow="0" w:firstColumn="1" w:lastColumn="0" w:noHBand="0" w:noVBand="1"/>
-        <w:tblDescription w:val="Tabela de layout de opções de formatação"/>
-      </w:tblPr>
-      <w:tblGrid>
-        <w:gridCol w:w="1321"/>
-        <w:gridCol w:w="7705"/>
-      </w:tblGrid>
-      <w:tr>
-        <w:tc>
-          <w:tcPr>
-            <w:tcW w:w="1344" w:type="dxa"/>
-            <w:tcMar>
-              <w:left w:w="720" w:type="dxa"/>
-            </w:tcMar>
-            <w:vAlign w:val="center"/>
-          </w:tcPr>
-          <w:p>
-            <w:pPr>
-              <w:spacing w:after="160" w:line="259" w:lineRule="auto"/>
-              <w:rPr>
-                <w:noProof/>
-                <w:lang w:val="pt-BR"/>
-              </w:rPr>
-            </w:pPr>
-            <w:r>
-              <w:rPr>
-                <w:noProof/>
-                <w:lang w:val="pt-BR" w:bidi="pt-BR"/>
-              </w:rPr>
-              <w:lastRenderedPageBreak/>
-              <w:drawing>
-                <wp:inline distT="0" distB="0" distL="0" distR="0" wp14:anchorId="63325DB7" wp14:editId="0CEFFF26">
-                  <wp:extent cx="304761" cy="361904"/>
-                  <wp:effectExtent l="19050" t="19050" r="19685" b="19685"/>
-                  <wp:docPr id="18" name="Imagem 18" descr="Ícone do comando Negrito"/>
-                  <wp:cNvGraphicFramePr>
-                    <a:graphicFrameLocks xmlns:a="http://schemas.openxmlformats.org/drawingml/2006/main" noChangeAspect="1"/>
-                  </wp:cNvGraphicFramePr>
-                  <a:graphic xmlns:a="http://schemas.openxmlformats.org/drawingml/2006/main">
-                    <a:graphicData uri="http://schemas.openxmlformats.org/drawingml/2006/picture">
-                      <pic:pic xmlns:pic="http://schemas.openxmlformats.org/drawingml/2006/picture">
-                        <pic:nvPicPr>
-                          <pic:cNvPr id="1" name=""/>
-                          <pic:cNvPicPr/>
-                        </pic:nvPicPr>
-                        <pic:blipFill>
-                          <a:blip r:embed="rId13"/>
-                          <a:stretch>
-                            <a:fillRect/>
-                          </a:stretch>
-                        </pic:blipFill>
-                        <pic:spPr>
-                          <a:xfrm>
-                            <a:off x="0" y="0"/>
-                            <a:ext cx="304761" cy="361904"/>
-                          </a:xfrm>
-                          <a:prstGeom prst="rect">
-                            <a:avLst/>
-                          </a:prstGeom>
-                          <a:ln w="3175">
-                            <a:solidFill>
-                              <a:schemeClr val="accent1">
-                                <a:lumMod val="50000"/>
-                              </a:schemeClr>
-                            </a:solidFill>
-                          </a:ln>
-                        </pic:spPr>
-                      </pic:pic>
-                    </a:graphicData>
-                  </a:graphic>
-                </wp:inline>
-              </w:drawing>
-            </w:r>
-          </w:p>
-        </w:tc>
-        <w:tc>
-          <w:tcPr>
-            <w:tcW w:w="8016" w:type="dxa"/>
-            <w:tcMar>
-              <w:left w:w="0" w:type="dxa"/>
-            </w:tcMar>
-            <w:vAlign w:val="center"/>
-          </w:tcPr>
-          <w:p>
-            <w:pPr>
-              <w:spacing w:after="160" w:line="259" w:lineRule="auto"/>
-              <w:rPr>
-                <w:noProof/>
-                <w:lang w:val="pt-BR"/>
-              </w:rPr>
-            </w:pPr>
-            <w:r>
-              <w:rPr>
-                <w:noProof/>
-                <w:lang w:val="pt-BR" w:bidi="pt-BR"/>
-              </w:rPr>
-              <w:t>Negrito (atalho de teclado: Ctrl+N)</w:t>
-            </w:r>
-          </w:p>
-        </w:tc>
-      </w:tr>
-      <w:tr>
-        <w:tc>
-          <w:tcPr>
-            <w:tcW w:w="1344" w:type="dxa"/>
-            <w:tcMar>
-              <w:left w:w="720" w:type="dxa"/>
-            </w:tcMar>
-            <w:vAlign w:val="center"/>
-          </w:tcPr>
-          <w:p>
-            <w:pPr>
-              <w:spacing w:after="160" w:line="259" w:lineRule="auto"/>
-              <w:rPr>
-                <w:noProof/>
-                <w:lang w:val="pt-BR"/>
-              </w:rPr>
-            </w:pPr>
-            <w:r>
-              <w:rPr>
-                <w:noProof/>
-                <w:lang w:val="pt-BR" w:bidi="pt-BR"/>
-              </w:rPr>
-              <w:drawing>
-                <wp:inline distT="0" distB="0" distL="0" distR="0" wp14:anchorId="6B4C20AD" wp14:editId="6BDC5BFC">
-                  <wp:extent cx="304761" cy="361904"/>
-                  <wp:effectExtent l="19050" t="19050" r="19685" b="19685"/>
-                  <wp:docPr id="21" name="Imagem 21" descr="Ícone do comando Itálico"/>
-                  <wp:cNvGraphicFramePr>
-                    <a:graphicFrameLocks xmlns:a="http://schemas.openxmlformats.org/drawingml/2006/main" noChangeAspect="1"/>
-                  </wp:cNvGraphicFramePr>
-                  <a:graphic xmlns:a="http://schemas.openxmlformats.org/drawingml/2006/main">
-                    <a:graphicData uri="http://schemas.openxmlformats.org/drawingml/2006/picture">
-                      <pic:pic xmlns:pic="http://schemas.openxmlformats.org/drawingml/2006/picture">
-                        <pic:nvPicPr>
-                          <pic:cNvPr id="1" name=""/>
-                          <pic:cNvPicPr/>
-                        </pic:nvPicPr>
-                        <pic:blipFill>
-                          <a:blip r:embed="rId14"/>
-                          <a:stretch>
-                            <a:fillRect/>
-                          </a:stretch>
-                        </pic:blipFill>
-                        <pic:spPr>
-                          <a:xfrm>
-                            <a:off x="0" y="0"/>
-                            <a:ext cx="304761" cy="361904"/>
-                          </a:xfrm>
-                          <a:prstGeom prst="rect">
-                            <a:avLst/>
-                          </a:prstGeom>
-                          <a:ln w="3175">
-                            <a:solidFill>
-                              <a:schemeClr val="accent1">
-                                <a:lumMod val="50000"/>
-                              </a:schemeClr>
-                            </a:solidFill>
-                          </a:ln>
-                        </pic:spPr>
-                      </pic:pic>
-                    </a:graphicData>
-                  </a:graphic>
-                </wp:inline>
-              </w:drawing>
-            </w:r>
-          </w:p>
-        </w:tc>
-        <w:tc>
-          <w:tcPr>
-            <w:tcW w:w="8016" w:type="dxa"/>
-            <w:tcMar>
-              <w:left w:w="0" w:type="dxa"/>
-            </w:tcMar>
-            <w:vAlign w:val="center"/>
-          </w:tcPr>
-          <w:p>
-            <w:pPr>
-              <w:spacing w:after="160" w:line="259" w:lineRule="auto"/>
-              <w:rPr>
-                <w:noProof/>
-                <w:lang w:val="pt-BR"/>
-              </w:rPr>
-            </w:pPr>
-            <w:r>
-              <w:rPr>
-                <w:noProof/>
-                <w:lang w:val="pt-BR" w:bidi="pt-BR"/>
-              </w:rPr>
-              <w:t>Itálico (atalho de teclado: Ctrl+I)</w:t>
-            </w:r>
-          </w:p>
-        </w:tc>
-      </w:tr>
-      <w:tr>
-        <w:tc>
-          <w:tcPr>
-            <w:tcW w:w="1344" w:type="dxa"/>
-            <w:tcMar>
-              <w:left w:w="720" w:type="dxa"/>
-            </w:tcMar>
-            <w:vAlign w:val="center"/>
-          </w:tcPr>
-          <w:p>
-            <w:pPr>
-              <w:spacing w:after="160" w:line="259" w:lineRule="auto"/>
-              <w:rPr>
-                <w:noProof/>
-                <w:lang w:val="pt-BR"/>
-              </w:rPr>
-            </w:pPr>
-            <w:r>
-              <w:rPr>
-                <w:noProof/>
-                <w:lang w:val="pt-BR" w:bidi="pt-BR"/>
-              </w:rPr>
-              <w:drawing>
-                <wp:inline distT="0" distB="0" distL="0" distR="0" wp14:anchorId="118C800F" wp14:editId="261BE72B">
-                  <wp:extent cx="285713" cy="339285"/>
-                  <wp:effectExtent l="19050" t="19050" r="19685" b="22860"/>
-                  <wp:docPr id="17" name="Imagem 17" descr="Ícone do comando Realce"/>
-                  <wp:cNvGraphicFramePr>
-                    <a:graphicFrameLocks xmlns:a="http://schemas.openxmlformats.org/drawingml/2006/main" noChangeAspect="1"/>
-                  </wp:cNvGraphicFramePr>
-                  <a:graphic xmlns:a="http://schemas.openxmlformats.org/drawingml/2006/main">
-                    <a:graphicData uri="http://schemas.openxmlformats.org/drawingml/2006/picture">
-                      <pic:pic xmlns:pic="http://schemas.openxmlformats.org/drawingml/2006/picture">
-                        <pic:nvPicPr>
-                          <pic:cNvPr id="1" name=""/>
-                          <pic:cNvPicPr/>
-                        </pic:nvPicPr>
-                        <pic:blipFill>
-                          <a:blip r:embed="rId15"/>
-                          <a:stretch>
-                            <a:fillRect/>
-                          </a:stretch>
-                        </pic:blipFill>
-                        <pic:spPr>
-                          <a:xfrm>
-                            <a:off x="0" y="0"/>
-                            <a:ext cx="285713" cy="339285"/>
-                          </a:xfrm>
-                          <a:prstGeom prst="rect">
-                            <a:avLst/>
-                          </a:prstGeom>
-                          <a:ln w="3175">
-                            <a:solidFill>
-                              <a:schemeClr val="accent1">
-                                <a:lumMod val="50000"/>
-                              </a:schemeClr>
-                            </a:solidFill>
-                          </a:ln>
-                        </pic:spPr>
-                      </pic:pic>
-                    </a:graphicData>
-                  </a:graphic>
-                </wp:inline>
-              </w:drawing>
-            </w:r>
-          </w:p>
-        </w:tc>
-        <w:tc>
-          <w:tcPr>
-            <w:tcW w:w="8016" w:type="dxa"/>
-            <w:tcMar>
-              <w:left w:w="0" w:type="dxa"/>
-            </w:tcMar>
-            <w:vAlign w:val="center"/>
-          </w:tcPr>
-          <w:p>
-            <w:pPr>
-              <w:spacing w:after="160" w:line="259" w:lineRule="auto"/>
-              <w:rPr>
-                <w:noProof/>
-                <w:lang w:val="pt-BR"/>
-              </w:rPr>
-            </w:pPr>
-            <w:r>
-              <w:rPr>
-                <w:noProof/>
-                <w:lang w:val="pt-BR" w:bidi="pt-BR"/>
-              </w:rPr>
-              <w:t>Realce</w:t>
-            </w:r>
-          </w:p>
-        </w:tc>
-      </w:tr>
-      <w:tr>
-        <w:tc>
-          <w:tcPr>
-            <w:tcW w:w="1344" w:type="dxa"/>
-            <w:tcMar>
-              <w:left w:w="720" w:type="dxa"/>
-            </w:tcMar>
-            <w:vAlign w:val="center"/>
-          </w:tcPr>
-          <w:p>
-            <w:pPr>
-              <w:spacing w:after="160" w:line="259" w:lineRule="auto"/>
-              <w:rPr>
-                <w:noProof/>
-                <w:lang w:val="pt-BR"/>
-              </w:rPr>
-            </w:pPr>
-            <w:r>
-              <w:rPr>
-                <w:noProof/>
-                <w:lang w:val="pt-BR" w:bidi="pt-BR"/>
-              </w:rPr>
-              <w:drawing>
-                <wp:inline distT="0" distB="0" distL="0" distR="0" wp14:anchorId="2B2F4AB1" wp14:editId="65943CAD">
-                  <wp:extent cx="295237" cy="350595"/>
-                  <wp:effectExtent l="19050" t="19050" r="10160" b="11430"/>
-                  <wp:docPr id="19" name="Imagem 19" descr="Ícone do comando Cor da fonte"/>
-                  <wp:cNvGraphicFramePr>
-                    <a:graphicFrameLocks xmlns:a="http://schemas.openxmlformats.org/drawingml/2006/main" noChangeAspect="1"/>
-                  </wp:cNvGraphicFramePr>
-                  <a:graphic xmlns:a="http://schemas.openxmlformats.org/drawingml/2006/main">
-                    <a:graphicData uri="http://schemas.openxmlformats.org/drawingml/2006/picture">
-                      <pic:pic xmlns:pic="http://schemas.openxmlformats.org/drawingml/2006/picture">
-                        <pic:nvPicPr>
-                          <pic:cNvPr id="1" name=""/>
-                          <pic:cNvPicPr/>
-                        </pic:nvPicPr>
-                        <pic:blipFill>
-                          <a:blip r:embed="rId16"/>
-                          <a:stretch>
-                            <a:fillRect/>
-                          </a:stretch>
-                        </pic:blipFill>
-                        <pic:spPr>
-                          <a:xfrm>
-                            <a:off x="0" y="0"/>
-                            <a:ext cx="295237" cy="350595"/>
-                          </a:xfrm>
-                          <a:prstGeom prst="rect">
-                            <a:avLst/>
-                          </a:prstGeom>
-                          <a:ln w="3175">
-                            <a:solidFill>
-                              <a:schemeClr val="accent1">
-                                <a:lumMod val="50000"/>
-                              </a:schemeClr>
-                            </a:solidFill>
-                          </a:ln>
-                        </pic:spPr>
-                      </pic:pic>
-                    </a:graphicData>
-                  </a:graphic>
-                </wp:inline>
-              </w:drawing>
-            </w:r>
-          </w:p>
-        </w:tc>
-        <w:tc>
-          <w:tcPr>
-            <w:tcW w:w="8016" w:type="dxa"/>
-            <w:tcMar>
-              <w:left w:w="0" w:type="dxa"/>
-            </w:tcMar>
-            <w:vAlign w:val="center"/>
-          </w:tcPr>
-          <w:p>
-            <w:pPr>
-              <w:spacing w:after="160" w:line="259" w:lineRule="auto"/>
-              <w:rPr>
-                <w:noProof/>
-                <w:lang w:val="pt-BR"/>
-              </w:rPr>
-            </w:pPr>
-            <w:r>
-              <w:rPr>
-                <w:noProof/>
-                <w:lang w:val="pt-BR" w:bidi="pt-BR"/>
-              </w:rPr>
-              <w:t>Cor da fonte</w:t>
-            </w:r>
-          </w:p>
-        </w:tc>
-      </w:tr>
-      <w:tr>
-        <w:tc>
-          <w:tcPr>
-            <w:tcW w:w="1344" w:type="dxa"/>
-            <w:tcMar>
-              <w:left w:w="720" w:type="dxa"/>
-            </w:tcMar>
-            <w:vAlign w:val="center"/>
-          </w:tcPr>
-          <w:p>
-            <w:pPr>
-              <w:spacing w:after="160" w:line="259" w:lineRule="auto"/>
-              <w:rPr>
-                <w:noProof/>
-                <w:lang w:val="pt-BR"/>
-              </w:rPr>
-            </w:pPr>
-            <w:r>
-              <w:rPr>
-                <w:noProof/>
-                <w:lang w:val="pt-BR" w:bidi="pt-BR"/>
-              </w:rPr>
-              <w:drawing>
-                <wp:inline distT="0" distB="0" distL="0" distR="0" wp14:anchorId="5563B347" wp14:editId="6CE19E54">
-                  <wp:extent cx="295238" cy="350595"/>
-                  <wp:effectExtent l="19050" t="19050" r="10160" b="11430"/>
-                  <wp:docPr id="13" name="Imagem 13" descr="Ícone do comando Marcadores"/>
-                  <wp:cNvGraphicFramePr>
-                    <a:graphicFrameLocks xmlns:a="http://schemas.openxmlformats.org/drawingml/2006/main" noChangeAspect="1"/>
-                  </wp:cNvGraphicFramePr>
-                  <a:graphic xmlns:a="http://schemas.openxmlformats.org/drawingml/2006/main">
-                    <a:graphicData uri="http://schemas.openxmlformats.org/drawingml/2006/picture">
-                      <pic:pic xmlns:pic="http://schemas.openxmlformats.org/drawingml/2006/picture">
-                        <pic:nvPicPr>
-                          <pic:cNvPr id="1" name=""/>
-                          <pic:cNvPicPr/>
-                        </pic:nvPicPr>
-                        <pic:blipFill>
-                          <a:blip r:embed="rId17">
-                            <a:extLst>
-                              <a:ext uri="{28A0092B-C50C-407E-A947-70E740481C1C}">
-                                <a14:useLocalDpi xmlns:a14="http://schemas.microsoft.com/office/drawing/2010/main" val="0"/>
-                              </a:ext>
-                            </a:extLst>
-                          </a:blip>
-                          <a:stretch>
-                            <a:fillRect/>
-                          </a:stretch>
-                        </pic:blipFill>
-                        <pic:spPr>
-                          <a:xfrm>
-                            <a:off x="0" y="0"/>
-                            <a:ext cx="295238" cy="350595"/>
-                          </a:xfrm>
-                          <a:prstGeom prst="rect">
-                            <a:avLst/>
-                          </a:prstGeom>
-                          <a:ln w="3175">
-                            <a:solidFill>
-                              <a:schemeClr val="accent1">
-                                <a:lumMod val="50000"/>
-                              </a:schemeClr>
-                            </a:solidFill>
-                          </a:ln>
-                        </pic:spPr>
-                      </pic:pic>
-                    </a:graphicData>
-                  </a:graphic>
-                </wp:inline>
-              </w:drawing>
-            </w:r>
-          </w:p>
-        </w:tc>
-        <w:tc>
-          <w:tcPr>
-            <w:tcW w:w="8016" w:type="dxa"/>
-            <w:tcMar>
-              <w:left w:w="0" w:type="dxa"/>
-            </w:tcMar>
-            <w:vAlign w:val="center"/>
-          </w:tcPr>
-          <w:p>
-            <w:pPr>
-              <w:spacing w:after="160" w:line="259" w:lineRule="auto"/>
-              <w:rPr>
-                <w:noProof/>
-                <w:lang w:val="pt-BR"/>
-              </w:rPr>
-            </w:pPr>
-            <w:r>
-              <w:rPr>
-                <w:noProof/>
-                <w:lang w:val="pt-BR" w:bidi="pt-BR"/>
-              </w:rPr>
-              <w:t>Marcadores</w:t>
-            </w:r>
-          </w:p>
-        </w:tc>
-      </w:tr>
-      <w:tr>
-        <w:tc>
-          <w:tcPr>
-            <w:tcW w:w="1344" w:type="dxa"/>
-            <w:tcMar>
-              <w:left w:w="720" w:type="dxa"/>
-            </w:tcMar>
-            <w:vAlign w:val="center"/>
-          </w:tcPr>
-          <w:p>
-            <w:pPr>
-              <w:spacing w:after="160" w:line="259" w:lineRule="auto"/>
-              <w:rPr>
-                <w:noProof/>
-                <w:lang w:val="pt-BR"/>
-              </w:rPr>
-            </w:pPr>
-            <w:r>
-              <w:rPr>
-                <w:noProof/>
-                <w:lang w:val="pt-BR" w:bidi="pt-BR"/>
-              </w:rPr>
-              <w:drawing>
-                <wp:inline distT="0" distB="0" distL="0" distR="0" wp14:anchorId="2684002B" wp14:editId="51D51FEE">
-                  <wp:extent cx="285713" cy="339285"/>
-                  <wp:effectExtent l="19050" t="19050" r="19685" b="22860"/>
-                  <wp:docPr id="12" name="Imagem 12" descr="Ícone do comando Numeração"/>
-                  <wp:cNvGraphicFramePr>
-                    <a:graphicFrameLocks xmlns:a="http://schemas.openxmlformats.org/drawingml/2006/main" noChangeAspect="1"/>
-                  </wp:cNvGraphicFramePr>
-                  <a:graphic xmlns:a="http://schemas.openxmlformats.org/drawingml/2006/main">
-                    <a:graphicData uri="http://schemas.openxmlformats.org/drawingml/2006/picture">
-                      <pic:pic xmlns:pic="http://schemas.openxmlformats.org/drawingml/2006/picture">
-                        <pic:nvPicPr>
-                          <pic:cNvPr id="1" name=""/>
-                          <pic:cNvPicPr/>
-                        </pic:nvPicPr>
-                        <pic:blipFill>
-                          <a:blip r:embed="rId18"/>
-                          <a:stretch>
-                            <a:fillRect/>
-                          </a:stretch>
-                        </pic:blipFill>
-                        <pic:spPr>
-                          <a:xfrm>
-                            <a:off x="0" y="0"/>
-                            <a:ext cx="285713" cy="339285"/>
-                          </a:xfrm>
-                          <a:prstGeom prst="rect">
-                            <a:avLst/>
-                          </a:prstGeom>
-                          <a:ln w="3175">
-                            <a:solidFill>
-                              <a:schemeClr val="accent1">
-                                <a:lumMod val="50000"/>
-                              </a:schemeClr>
-                            </a:solidFill>
-                          </a:ln>
-                        </pic:spPr>
-                      </pic:pic>
-                    </a:graphicData>
-                  </a:graphic>
-                </wp:inline>
-              </w:drawing>
-            </w:r>
-          </w:p>
-        </w:tc>
-        <w:tc>
-          <w:tcPr>
-            <w:tcW w:w="8016" w:type="dxa"/>
-            <w:tcMar>
-              <w:left w:w="0" w:type="dxa"/>
-            </w:tcMar>
-            <w:vAlign w:val="center"/>
-          </w:tcPr>
-          <w:p>
-            <w:pPr>
-              <w:spacing w:after="160" w:line="259" w:lineRule="auto"/>
-              <w:rPr>
-                <w:noProof/>
-                <w:lang w:val="pt-BR"/>
-              </w:rPr>
-            </w:pPr>
-            <w:r>
-              <w:rPr>
-                <w:noProof/>
-                <w:lang w:val="pt-BR" w:bidi="pt-BR"/>
-              </w:rPr>
-              <w:t>Numeração</w:t>
-            </w:r>
-          </w:p>
-        </w:tc>
-      </w:tr>
-    </w:tbl>
-    <w:p>
-      <w:pPr>
-        <w:rPr>
-          <w:noProof/>
-          <w:lang w:val="pt-BR"/>
-        </w:rPr>
-      </w:pPr>
-      <w:r>
-        <w:rPr>
-          <w:rStyle w:val="Forte"/>
-          <w:noProof/>
-          <w:lang w:val="pt-BR" w:bidi="pt-BR"/>
-        </w:rPr>
-        <w:t>Dica profissional:</w:t>
-      </w:r>
-      <w:r>
-        <w:rPr>
-          <w:noProof/>
-          <w:lang w:val="pt-BR" w:bidi="pt-BR"/>
-        </w:rPr>
-        <w:t xml:space="preserve"> caso tenha selecionado palavras inteiras para este exercício, você notou que o Word exibiu uma pequena barra de ferramentas, com as opções de formatação de fonte?</w:t>
-      </w:r>
-    </w:p>
-    <w:p>
-      <w:pPr>
-        <w:rPr>
-          <w:noProof/>
-          <w:lang w:val="pt-BR"/>
-        </w:rPr>
-      </w:pPr>
-      <w:r>
-        <w:rPr>
-          <w:noProof/>
-          <w:lang w:val="pt-BR" w:bidi="pt-BR"/>
-        </w:rPr>
-        <w:drawing>
-          <wp:anchor distT="0" distB="0" distL="114300" distR="114300" simplePos="0" relativeHeight="251660288" behindDoc="0" locked="0" layoutInCell="1" allowOverlap="1" wp14:anchorId="7AFBB82E" wp14:editId="0DACA0FF">
-            <wp:simplePos x="0" y="0"/>
-            <wp:positionH relativeFrom="column">
-              <wp:posOffset>19050</wp:posOffset>
-            </wp:positionH>
-            <wp:positionV relativeFrom="paragraph">
-              <wp:posOffset>122555</wp:posOffset>
-            </wp:positionV>
-            <wp:extent cx="2377440" cy="548640"/>
-            <wp:effectExtent l="19050" t="19050" r="22860" b="22860"/>
-            <wp:wrapSquare wrapText="right"/>
-            <wp:docPr id="7" name="Imagem 7" descr="Barra de ferramentas contextual com comandos de formatação de texto"/>
-            <wp:cNvGraphicFramePr>
-              <a:graphicFrameLocks xmlns:a="http://schemas.openxmlformats.org/drawingml/2006/main" noChangeAspect="1"/>
-            </wp:cNvGraphicFramePr>
-            <a:graphic xmlns:a="http://schemas.openxmlformats.org/drawingml/2006/main">
-              <a:graphicData uri="http://schemas.openxmlformats.org/drawingml/2006/picture">
-                <pic:pic xmlns:pic="http://schemas.openxmlformats.org/drawingml/2006/picture">
-                  <pic:nvPicPr>
-                    <pic:cNvPr id="1" name=""/>
-                    <pic:cNvPicPr/>
-                  </pic:nvPicPr>
-                  <pic:blipFill>
-                    <a:blip r:embed="rId19"/>
-                    <a:stretch>
-                      <a:fillRect/>
-                    </a:stretch>
-                  </pic:blipFill>
-                  <pic:spPr>
-                    <a:xfrm>
-                      <a:off x="0" y="0"/>
-                      <a:ext cx="2377440" cy="548640"/>
-                    </a:xfrm>
-                    <a:prstGeom prst="rect">
-                      <a:avLst/>
-                    </a:prstGeom>
-                    <a:ln w="3175">
-                      <a:solidFill>
-                        <a:schemeClr val="accent1">
-                          <a:lumMod val="50000"/>
-                        </a:schemeClr>
-                      </a:solidFill>
-                    </a:ln>
-                  </pic:spPr>
-                </pic:pic>
-              </a:graphicData>
-            </a:graphic>
-            <wp14:sizeRelV relativeFrom="margin">
-              <wp14:pctHeight>0</wp14:pctHeight>
-            </wp14:sizeRelV>
-          </wp:anchor>
-        </w:drawing>
-      </w:r>
-      <w:r>
-        <w:rPr>
-          <w:noProof/>
-          <w:lang w:val="pt-BR" w:bidi="pt-BR"/>
-        </w:rPr>
-        <w:t>Com isso e os atalhos de teclado, como Ctrl+N e Ctrl+I, você economiza tempo por não precisar ir para a guia Página Inicial o tempo todo.</w:t>
-      </w:r>
-    </w:p>
-    <w:p>
-      <w:pPr>
-        <w:pageBreakBefore/>
-        <w:pBdr>
-          <w:bottom w:val="single" w:sz="18" w:space="1" w:color="2B579A" w:themeColor="accent5"/>
-        </w:pBdr>
-        <w:rPr>
-          <w:rFonts w:ascii="Segoe UI Light" w:eastAsiaTheme="majorEastAsia" w:hAnsi="Segoe UI Light" w:cstheme="majorBidi"/>
-          <w:noProof/>
-          <w:color w:val="3B3838" w:themeColor="background2" w:themeShade="40"/>
-          <w:kern w:val="28"/>
-          <w:sz w:val="52"/>
-          <w:szCs w:val="52"/>
-          <w:lang w:val="pt-BR"/>
-          <w14:ligatures w14:val="standard"/>
-          <w14:numForm w14:val="oldStyle"/>
-        </w:rPr>
-      </w:pPr>
-      <w:r>
-        <w:rPr>
-          <w:rFonts w:ascii="Segoe UI Light" w:eastAsiaTheme="majorEastAsia" w:hAnsi="Segoe UI Light" w:cstheme="majorBidi"/>
-          <w:noProof/>
-          <w:color w:val="3B3838" w:themeColor="background2" w:themeShade="40"/>
-          <w:kern w:val="28"/>
-          <w:sz w:val="52"/>
-          <w:szCs w:val="52"/>
-          <w:lang w:val="pt-BR" w:bidi="pt-BR"/>
-          <w14:ligatures w14:val="standard"/>
-          <w14:numForm w14:val="oldStyle"/>
-        </w:rPr>
-        <w:lastRenderedPageBreak/>
-        <w:t>Faça mágica: use Estilos de Título</w:t>
-      </w:r>
-    </w:p>
-    <w:p>
-      <w:pPr>
-        <w:rPr>
-          <w:noProof/>
-          <w:lang w:val="pt-BR"/>
-        </w:rPr>
-      </w:pPr>
-      <w:r>
-        <w:rPr>
-          <w:noProof/>
-          <w:lang w:val="pt-BR" w:bidi="pt-BR"/>
-        </w:rPr>
-        <w:t xml:space="preserve">O título desta parte ("Faça mágica: use Estilos de Título") é semelhante a outros títulos neste documento, mas não é tão útil. Ele é formatado com as </w:t>
-      </w:r>
-      <w:r>
-        <w:rPr>
-          <w:i/>
-          <w:noProof/>
-          <w:lang w:val="pt-BR" w:bidi="pt-BR"/>
-        </w:rPr>
-        <w:t>configurações de fonte</w:t>
-      </w:r>
-      <w:r>
-        <w:rPr>
-          <w:noProof/>
-          <w:lang w:val="pt-BR" w:bidi="pt-BR"/>
-        </w:rPr>
-        <w:t xml:space="preserve"> (fonte, tamanho e cor), enquanto outros títulos são formatados com um </w:t>
-      </w:r>
-      <w:r>
-        <w:rPr>
-          <w:i/>
-          <w:noProof/>
-          <w:lang w:val="pt-BR" w:bidi="pt-BR"/>
-        </w:rPr>
-        <w:t>Estilo de Título</w:t>
-      </w:r>
-      <w:r>
-        <w:rPr>
-          <w:noProof/>
-          <w:lang w:val="pt-BR" w:bidi="pt-BR"/>
-        </w:rPr>
-        <w:t xml:space="preserve"> (Título 1, para ser mais exato).</w:t>
-      </w:r>
-    </w:p>
-    <w:tbl>
-      <w:tblPr>
-        <w:tblW w:w="5000" w:type="pct"/>
-        <w:tblCellMar>
-          <w:left w:w="0" w:type="dxa"/>
-          <w:right w:w="0" w:type="dxa"/>
-        </w:tblCellMar>
-        <w:tblLook w:val="0600" w:firstRow="0" w:lastRow="0" w:firstColumn="0" w:lastColumn="0" w:noHBand="1" w:noVBand="1"/>
-        <w:tblDescription w:val="Tabela de layout para a formatação de estilo de título"/>
-      </w:tblPr>
-      <w:tblGrid>
-        <w:gridCol w:w="2959"/>
-        <w:gridCol w:w="6067"/>
-      </w:tblGrid>
-      <w:tr>
-        <w:tc>
-          <w:tcPr>
-            <w:tcW w:w="2970" w:type="dxa"/>
-            <w:tcMar>
-              <w:bottom w:w="72" w:type="dxa"/>
-            </w:tcMar>
-          </w:tcPr>
-          <w:p>
-            <w:pPr>
-              <w:rPr>
-                <w:noProof/>
-                <w:lang w:val="pt-BR"/>
-              </w:rPr>
-            </w:pPr>
-            <w:r>
-              <w:rPr>
-                <w:noProof/>
-                <w:lang w:val="pt-BR" w:bidi="pt-BR"/>
-              </w:rPr>
-              <w:drawing>
-                <wp:inline distT="0" distB="0" distL="0" distR="0" wp14:anchorId="13F6AC2C" wp14:editId="136683EC">
-                  <wp:extent cx="1735328" cy="1024128"/>
-                  <wp:effectExtent l="19050" t="19050" r="17780" b="24130"/>
-                  <wp:docPr id="8" name="Imagem 8" descr="Título mostrando o botão expandir/recolher"/>
-                  <wp:cNvGraphicFramePr>
-                    <a:graphicFrameLocks xmlns:a="http://schemas.openxmlformats.org/drawingml/2006/main" noChangeAspect="1"/>
-                  </wp:cNvGraphicFramePr>
-                  <a:graphic xmlns:a="http://schemas.openxmlformats.org/drawingml/2006/main">
-                    <a:graphicData uri="http://schemas.openxmlformats.org/drawingml/2006/picture">
-                      <pic:pic xmlns:pic="http://schemas.openxmlformats.org/drawingml/2006/picture">
-                        <pic:nvPicPr>
-                          <pic:cNvPr id="1" name=""/>
-                          <pic:cNvPicPr/>
-                        </pic:nvPicPr>
-                        <pic:blipFill>
-                          <a:blip r:embed="rId20"/>
-                          <a:stretch>
-                            <a:fillRect/>
-                          </a:stretch>
-                        </pic:blipFill>
-                        <pic:spPr>
-                          <a:xfrm>
-                            <a:off x="0" y="0"/>
-                            <a:ext cx="1735328" cy="1024128"/>
-                          </a:xfrm>
-                          <a:prstGeom prst="rect">
-                            <a:avLst/>
-                          </a:prstGeom>
-                          <a:ln w="3175">
-                            <a:solidFill>
-                              <a:srgbClr val="1F4E79"/>
-                            </a:solidFill>
-                          </a:ln>
-                        </pic:spPr>
-                      </pic:pic>
-                    </a:graphicData>
-                  </a:graphic>
-                </wp:inline>
-              </w:drawing>
-            </w:r>
-          </w:p>
-        </w:tc>
-        <w:tc>
-          <w:tcPr>
-            <w:tcW w:w="6390" w:type="dxa"/>
-            <w:tcMar>
-              <w:left w:w="72" w:type="dxa"/>
-            </w:tcMar>
-          </w:tcPr>
-          <w:p>
-            <w:pPr>
-              <w:rPr>
-                <w:noProof/>
-                <w:lang w:val="pt-BR"/>
-              </w:rPr>
-            </w:pPr>
-            <w:r>
-              <w:rPr>
-                <w:noProof/>
-                <w:lang w:val="pt-BR" w:bidi="pt-BR"/>
-              </w:rPr>
-              <w:t>Está vendo o triangulo pequeno ao passar o mouse sobre os outros títulos?</w:t>
-            </w:r>
-          </w:p>
-          <w:p>
-            <w:pPr>
-              <w:rPr>
-                <w:noProof/>
-                <w:lang w:val="pt-BR"/>
-              </w:rPr>
-            </w:pPr>
-            <w:r>
-              <w:rPr>
-                <w:noProof/>
-                <w:lang w:val="pt-BR" w:bidi="pt-BR"/>
-              </w:rPr>
-              <w:t>Você pode recolher ou expandir tudo sob um título, como uma estrutura de tópicos. Mas neste não está funcionando. Vamos corrigir isso.</w:t>
-            </w:r>
-          </w:p>
-        </w:tc>
-      </w:tr>
-    </w:tbl>
-    <w:p>
-      <w:pPr>
-        <w:rPr>
-          <w:noProof/>
-          <w:lang w:val="pt-BR"/>
-        </w:rPr>
-      </w:pPr>
-      <w:r>
-        <w:rPr>
-          <w:rStyle w:val="nfase"/>
-          <w:noProof/>
-          <w:lang w:val="pt-BR" w:bidi="pt-BR"/>
-        </w:rPr>
-        <w:t>Experimente:</w:t>
-      </w:r>
-      <w:r>
-        <w:rPr>
-          <w:noProof/>
-          <w:lang w:val="pt-BR" w:bidi="pt-BR"/>
-        </w:rPr>
-        <w:t xml:space="preserve"> aplique o estilo </w:t>
-      </w:r>
-      <w:r>
-        <w:rPr>
-          <w:rStyle w:val="Forte"/>
-          <w:noProof/>
-          <w:lang w:val="pt-BR" w:bidi="pt-BR"/>
-        </w:rPr>
-        <w:t>Título 1</w:t>
-      </w:r>
-      <w:r>
-        <w:rPr>
-          <w:noProof/>
-          <w:lang w:val="pt-BR" w:bidi="pt-BR"/>
-        </w:rPr>
-        <w:t>:</w:t>
-      </w:r>
-    </w:p>
-    <w:p>
-      <w:pPr>
-        <w:pStyle w:val="Numerada"/>
-        <w:numPr>
-          <w:ilvl w:val="0"/>
-          <w:numId w:val="7"/>
-        </w:numPr>
-        <w:rPr>
-          <w:noProof/>
-          <w:lang w:val="pt-BR"/>
-        </w:rPr>
-      </w:pPr>
-      <w:r>
-        <w:rPr>
-          <w:noProof/>
-          <w:lang w:val="pt-BR" w:bidi="pt-BR"/>
-        </w:rPr>
-        <w:t>Posicione seu cursor em alguma parte do título acima ("Faça mágica: use Estilos de Título"), mas não selecione nada.</w:t>
-      </w:r>
-    </w:p>
-    <w:p>
-      <w:pPr>
-        <w:pStyle w:val="Numerada"/>
-        <w:numPr>
-          <w:ilvl w:val="0"/>
-          <w:numId w:val="1"/>
-        </w:numPr>
-        <w:rPr>
-          <w:noProof/>
-          <w:lang w:val="pt-BR"/>
-        </w:rPr>
-      </w:pPr>
-      <w:r>
-        <w:rPr>
-          <w:noProof/>
-          <w:lang w:val="pt-BR" w:bidi="pt-BR"/>
-        </w:rPr>
-        <w:t xml:space="preserve">Na guia </w:t>
-      </w:r>
-      <w:r>
-        <w:rPr>
-          <w:rStyle w:val="Forte"/>
-          <w:noProof/>
-          <w:lang w:val="pt-BR" w:bidi="pt-BR"/>
-        </w:rPr>
-        <w:t>Página Inicial</w:t>
-      </w:r>
-      <w:r>
-        <w:rPr>
-          <w:noProof/>
-          <w:lang w:val="pt-BR" w:bidi="pt-BR"/>
-        </w:rPr>
-        <w:t xml:space="preserve">, localize </w:t>
-      </w:r>
-      <w:r>
-        <w:rPr>
-          <w:rStyle w:val="Forte"/>
-          <w:noProof/>
-          <w:lang w:val="pt-BR" w:bidi="pt-BR"/>
-        </w:rPr>
-        <w:t>Estilos</w:t>
-      </w:r>
-      <w:r>
-        <w:rPr>
-          <w:noProof/>
-          <w:lang w:val="pt-BR" w:bidi="pt-BR"/>
-        </w:rPr>
-        <w:t xml:space="preserve"> e selecione </w:t>
-      </w:r>
-      <w:r>
-        <w:rPr>
-          <w:rStyle w:val="Forte"/>
-          <w:noProof/>
-          <w:lang w:val="pt-BR" w:bidi="pt-BR"/>
-        </w:rPr>
-        <w:t>Título 1</w:t>
-      </w:r>
-      <w:r>
-        <w:rPr>
-          <w:noProof/>
-          <w:lang w:val="pt-BR" w:bidi="pt-BR"/>
-        </w:rPr>
-        <w:t xml:space="preserve"> (atalho de teclado Ctrl+Alt+1).</w:t>
-      </w:r>
-    </w:p>
-    <w:p>
-      <w:pPr>
-        <w:rPr>
-          <w:noProof/>
-          <w:lang w:val="pt-BR"/>
-        </w:rPr>
-      </w:pPr>
-      <w:r>
-        <w:rPr>
-          <w:noProof/>
-          <w:lang w:val="pt-BR" w:bidi="pt-BR"/>
-        </w:rPr>
-        <w:t>Pronto! Agora parece um título e também se comporta como um.</w:t>
-      </w:r>
-    </w:p>
-    <w:p>
-      <w:pPr>
-        <w:pStyle w:val="Ttulo1QuebradePgina"/>
-        <w:rPr>
-          <w:noProof/>
-          <w:lang w:val="pt-BR"/>
-        </w:rPr>
-      </w:pPr>
-      <w:r>
-        <w:rPr>
-          <w:noProof/>
-          <w:lang w:val="pt-BR" w:bidi="pt-BR"/>
-        </w:rPr>
-        <w:lastRenderedPageBreak/>
-        <w:t>Faça uma transformação instantânea no seu documento</w:t>
-      </w:r>
-    </w:p>
-    <w:p>
-      <w:pPr>
-        <w:rPr>
-          <w:noProof/>
-          <w:lang w:val="pt-BR"/>
-        </w:rPr>
-      </w:pPr>
-      <w:r>
-        <w:rPr>
-          <w:rFonts w:ascii="Segoe UI Light" w:eastAsia="Segoe UI Light" w:hAnsi="Segoe UI Light" w:cs="Segoe UI Light"/>
-          <w:noProof/>
-          <w:color w:val="363636"/>
-          <w:lang w:val="pt-BR" w:bidi="pt-BR"/>
-        </w:rPr>
-        <w:drawing>
-          <wp:inline distT="0" distB="0" distL="0" distR="0" wp14:anchorId="6C0B6A1D" wp14:editId="544B4819">
-            <wp:extent cx="2923858" cy="1781593"/>
-            <wp:effectExtent l="19050" t="19050" r="10160" b="28575"/>
-            <wp:docPr id="15" name="Imagem 15" descr="Exemplo de Temas do Word do Office 365"/>
-            <wp:cNvGraphicFramePr>
-              <a:graphicFrameLocks xmlns:a="http://schemas.openxmlformats.org/drawingml/2006/main" noChangeAspect="1"/>
-            </wp:cNvGraphicFramePr>
-            <a:graphic xmlns:a="http://schemas.openxmlformats.org/drawingml/2006/main">
-              <a:graphicData uri="http://schemas.openxmlformats.org/drawingml/2006/picture">
-                <pic:pic xmlns:pic="http://schemas.openxmlformats.org/drawingml/2006/picture">
-                  <pic:nvPicPr>
-                    <pic:cNvPr id="0" name="Imagem 30" descr="Temas do Word do Office 365"/>
-                    <pic:cNvPicPr>
-                      <a:picLocks noChangeAspect="1" noChangeArrowheads="1"/>
-                    </pic:cNvPicPr>
-                  </pic:nvPicPr>
-                  <pic:blipFill>
-                    <a:blip r:embed="rId21"/>
-                    <a:stretch>
-                      <a:fillRect/>
-                    </a:stretch>
-                  </pic:blipFill>
-                  <pic:spPr bwMode="auto">
-                    <a:xfrm>
-                      <a:off x="0" y="0"/>
-                      <a:ext cx="2923858" cy="1781593"/>
-                    </a:xfrm>
-                    <a:prstGeom prst="rect">
-                      <a:avLst/>
-                    </a:prstGeom>
-                    <a:noFill/>
-                    <a:ln w="3175" cap="flat" cmpd="sng" algn="ctr">
-                      <a:solidFill>
-                        <a:schemeClr val="accent1">
-                          <a:lumMod val="50000"/>
-                        </a:schemeClr>
-                      </a:solidFill>
-                      <a:prstDash val="solid"/>
-                      <a:round/>
-                      <a:headEnd type="none" w="med" len="med"/>
-                      <a:tailEnd type="none" w="med" len="med"/>
-                    </a:ln>
-                    <a:extLst>
-                      <a:ext uri="{53640926-AAD7-44D8-BBD7-CCE9431645EC}">
-                        <a14:shadowObscured xmlns:a14="http://schemas.microsoft.com/office/drawing/2010/main"/>
-                      </a:ext>
-                    </a:extLst>
-                  </pic:spPr>
-                </pic:pic>
-              </a:graphicData>
-            </a:graphic>
-          </wp:inline>
-        </w:drawing>
-      </w:r>
-    </w:p>
-    <w:p>
-      <w:pPr>
-        <w:rPr>
-          <w:noProof/>
-          <w:lang w:val="pt-BR"/>
-        </w:rPr>
-      </w:pPr>
-      <w:r>
-        <w:rPr>
-          <w:noProof/>
-          <w:lang w:val="pt-BR" w:bidi="pt-BR"/>
-        </w:rPr>
-        <w:t>Com os conjuntos de estilos e temas você altera completamente a aparência do seu documento em um instante. Eles funcionam melhor quando o documento é formatado com estilos (portanto, é bom termos corrigido esse Estilo de Título acima).</w:t>
-      </w:r>
-    </w:p>
-    <w:p>
-      <w:pPr>
-        <w:rPr>
-          <w:noProof/>
-          <w:lang w:val="pt-BR"/>
-        </w:rPr>
-      </w:pPr>
-      <w:r>
-        <w:rPr>
-          <w:rStyle w:val="nfase"/>
-          <w:noProof/>
-          <w:lang w:val="pt-BR" w:bidi="pt-BR"/>
-        </w:rPr>
-        <w:t>Experimente:</w:t>
-      </w:r>
-      <w:r>
-        <w:rPr>
-          <w:noProof/>
-          <w:lang w:val="pt-BR" w:bidi="pt-BR"/>
-        </w:rPr>
-        <w:t xml:space="preserve"> explore conjuntos de estilos e temas:</w:t>
-      </w:r>
-    </w:p>
-    <w:p>
-      <w:pPr>
-        <w:pStyle w:val="Numerada"/>
-        <w:numPr>
-          <w:ilvl w:val="0"/>
-          <w:numId w:val="9"/>
-        </w:numPr>
-        <w:rPr>
-          <w:noProof/>
-          <w:lang w:val="pt-BR"/>
-        </w:rPr>
-      </w:pPr>
-      <w:r>
-        <w:rPr>
-          <w:noProof/>
-          <w:lang w:val="pt-BR" w:bidi="pt-BR"/>
-        </w:rPr>
-        <w:t xml:space="preserve">Na guia </w:t>
-      </w:r>
-      <w:r>
-        <w:rPr>
-          <w:rStyle w:val="Forte"/>
-          <w:noProof/>
-          <w:lang w:val="pt-BR" w:bidi="pt-BR"/>
-        </w:rPr>
-        <w:t>Design</w:t>
-      </w:r>
-      <w:r>
-        <w:rPr>
-          <w:noProof/>
-          <w:lang w:val="pt-BR" w:bidi="pt-BR"/>
-        </w:rPr>
-        <w:t xml:space="preserve">, selecione </w:t>
-      </w:r>
-      <w:r>
-        <w:rPr>
-          <w:rStyle w:val="Forte"/>
-          <w:noProof/>
-          <w:lang w:val="pt-BR" w:bidi="pt-BR"/>
-        </w:rPr>
-        <w:t>Temas</w:t>
-      </w:r>
-      <w:r>
-        <w:rPr>
-          <w:noProof/>
-          <w:lang w:val="pt-BR" w:bidi="pt-BR"/>
-        </w:rPr>
-        <w:t xml:space="preserve"> e escolha um tema no menu suspenso.</w:t>
-      </w:r>
-      <w:r>
-        <w:rPr>
-          <w:noProof/>
-          <w:lang w:val="pt-BR" w:bidi="pt-BR"/>
-        </w:rPr>
-        <w:br/>
-        <w:t>Veja como a galeria de conjuntos de estilos é atualizada para refletir o tema escolhido.</w:t>
-      </w:r>
-    </w:p>
-    <w:p>
-      <w:pPr>
-        <w:pStyle w:val="Numerada"/>
-        <w:rPr>
-          <w:noProof/>
-          <w:lang w:val="pt-BR"/>
-        </w:rPr>
-      </w:pPr>
-      <w:r>
-        <w:rPr>
-          <w:noProof/>
-          <w:lang w:val="pt-BR" w:bidi="pt-BR"/>
-        </w:rPr>
-        <w:t>Selecione um tema desejado no menu suspenso e clique para aplicar.</w:t>
-      </w:r>
-    </w:p>
-    <w:p>
-      <w:pPr>
-        <w:pStyle w:val="Ttulo1QuebradePgina"/>
-        <w:rPr>
-          <w:noProof/>
-          <w:lang w:val="pt-BR"/>
-        </w:rPr>
-      </w:pPr>
-      <w:r>
-        <w:rPr>
-          <w:noProof/>
-          <w:lang w:val="pt-BR" w:bidi="pt-BR"/>
-        </w:rPr>
-        <w:lastRenderedPageBreak/>
-        <w:t>Apenas por diversão</w:t>
-      </w:r>
-    </w:p>
-    <w:p>
-      <w:pPr>
-        <w:rPr>
-          <w:noProof/>
-          <w:lang w:val="pt-BR"/>
-        </w:rPr>
-      </w:pPr>
-      <w:r>
-        <w:rPr>
-          <w:noProof/>
-          <w:lang w:val="pt-BR" w:bidi="pt-BR"/>
-        </w:rPr>
-        <w:t>Se você tiver um pouco mais de tempo, experimente isto.</w:t>
-      </w:r>
-    </w:p>
-    <w:p>
-      <w:pPr>
-        <w:rPr>
-          <w:noProof/>
-          <w:lang w:val="pt-BR"/>
-        </w:rPr>
-      </w:pPr>
-      <w:r>
-        <w:rPr>
-          <w:rStyle w:val="nfase"/>
-          <w:noProof/>
-          <w:lang w:val="pt-BR" w:bidi="pt-BR"/>
-        </w:rPr>
-        <w:t>Experimente:</w:t>
-      </w:r>
-      <w:r>
-        <w:rPr>
-          <w:noProof/>
-          <w:lang w:val="pt-BR" w:bidi="pt-BR"/>
-        </w:rPr>
-        <w:t xml:space="preserve"> localizar e substituir</w:t>
-      </w:r>
-    </w:p>
-    <w:p>
-      <w:pPr>
-        <w:rPr>
-          <w:noProof/>
-          <w:lang w:val="pt-BR"/>
-        </w:rPr>
-      </w:pPr>
-      <w:r>
-        <w:rPr>
-          <w:noProof/>
-          <w:lang w:val="pt-BR" w:bidi="pt-BR"/>
-        </w:rPr>
-        <w:t xml:space="preserve">Pressione </w:t>
-      </w:r>
-      <w:r>
-        <w:rPr>
-          <w:rStyle w:val="Forte"/>
-          <w:noProof/>
-          <w:lang w:val="pt-BR" w:bidi="pt-BR"/>
-        </w:rPr>
-        <w:t>Ctrl+U</w:t>
-      </w:r>
-      <w:r>
-        <w:rPr>
-          <w:noProof/>
-          <w:lang w:val="pt-BR" w:bidi="pt-BR"/>
-        </w:rPr>
-        <w:t xml:space="preserve"> e use Localizar/Substituir para substituir todas as instâncias de </w:t>
-      </w:r>
-      <w:r>
-        <w:rPr>
-          <w:rStyle w:val="nfaseIntensa"/>
-          <w:noProof/>
-          <w:lang w:val="pt-BR" w:bidi="pt-BR"/>
-        </w:rPr>
-        <w:t>Experimente</w:t>
-      </w:r>
-      <w:r>
-        <w:rPr>
-          <w:noProof/>
-          <w:lang w:val="pt-BR" w:bidi="pt-BR"/>
-        </w:rPr>
-        <w:t xml:space="preserve"> por </w:t>
-      </w:r>
-      <w:r>
-        <w:rPr>
-          <w:rStyle w:val="nfaseIntensa"/>
-          <w:noProof/>
-          <w:lang w:val="pt-BR" w:bidi="pt-BR"/>
-        </w:rPr>
-        <w:t>Eu experimentei</w:t>
-      </w:r>
-      <w:r>
-        <w:rPr>
-          <w:noProof/>
-          <w:lang w:val="pt-BR" w:bidi="pt-BR"/>
-        </w:rPr>
-        <w:t>.</w:t>
-      </w:r>
-    </w:p>
-    <w:p>
-      <w:pPr>
-        <w:rPr>
-          <w:noProof/>
-          <w:lang w:val="pt-BR"/>
-        </w:rPr>
-      </w:pPr>
-      <w:r>
-        <w:rPr>
-          <w:noProof/>
-          <w:lang w:val="pt-BR" w:bidi="pt-BR"/>
-        </w:rPr>
-        <w:drawing>
-          <wp:inline distT="0" distB="0" distL="0" distR="0" wp14:anchorId="5AA4A314" wp14:editId="55CEEBA3">
-            <wp:extent cx="2667000" cy="1495425"/>
-            <wp:effectExtent l="19050" t="19050" r="19050" b="28575"/>
-            <wp:docPr id="1" name="Imagem 1" descr="A caixa de diálogo Localizar e Substituir, com &quot;Experimente&quot; na caixa &quot;Localizar&quot; e &quot;Eu experimentei&quot; na caixa &quot;Substituir por&quot;"/>
-            <wp:cNvGraphicFramePr>
-              <a:graphicFrameLocks xmlns:a="http://schemas.openxmlformats.org/drawingml/2006/main" noChangeAspect="1"/>
-            </wp:cNvGraphicFramePr>
-            <a:graphic xmlns:a="http://schemas.openxmlformats.org/drawingml/2006/main">
-              <a:graphicData uri="http://schemas.openxmlformats.org/drawingml/2006/picture">
-                <pic:pic xmlns:pic="http://schemas.openxmlformats.org/drawingml/2006/picture">
-                  <pic:nvPicPr>
-                    <pic:cNvPr id="1" name="LocalizarSubstituir.jpg"/>
-                    <pic:cNvPicPr/>
-                  </pic:nvPicPr>
-                  <pic:blipFill>
-                    <a:blip r:embed="rId22"/>
-                    <a:stretch>
-                      <a:fillRect/>
-                    </a:stretch>
-                  </pic:blipFill>
-                  <pic:spPr>
-                    <a:xfrm>
-                      <a:off x="0" y="0"/>
-                      <a:ext cx="2667000" cy="1495425"/>
-                    </a:xfrm>
-                    <a:prstGeom prst="rect">
-                      <a:avLst/>
-                    </a:prstGeom>
-                    <a:ln w="3175">
-                      <a:solidFill>
-                        <a:schemeClr val="accent1">
-                          <a:lumMod val="50000"/>
-                        </a:schemeClr>
-                      </a:solidFill>
-                    </a:ln>
-                  </pic:spPr>
-                </pic:pic>
-              </a:graphicData>
-            </a:graphic>
-          </wp:inline>
-        </w:drawing>
-      </w:r>
-    </w:p>
-    <w:p>
-      <w:pPr>
-        <w:keepNext/>
-        <w:rPr>
-          <w:noProof/>
-          <w:lang w:val="pt-BR"/>
-        </w:rPr>
-      </w:pPr>
-      <w:r>
-        <w:rPr>
-          <w:rStyle w:val="nfase"/>
-          <w:noProof/>
-          <w:lang w:val="pt-BR" w:bidi="pt-BR"/>
-        </w:rPr>
-        <w:t>Experimente:</w:t>
-      </w:r>
-      <w:r>
-        <w:rPr>
-          <w:noProof/>
-          <w:lang w:val="pt-BR" w:bidi="pt-BR"/>
-        </w:rPr>
-        <w:t xml:space="preserve"> quebrar o texto em torno de imagens</w:t>
-      </w:r>
-    </w:p>
-    <w:p>
-      <w:pPr>
-        <w:rPr>
-          <w:noProof/>
-          <w:lang w:val="pt-BR"/>
-        </w:rPr>
-      </w:pPr>
-      <w:r>
-        <w:rPr>
-          <w:noProof/>
-          <w:lang w:val="pt-BR" w:bidi="pt-BR"/>
-        </w:rPr>
-        <w:drawing>
-          <wp:anchor distT="118745" distB="118745" distL="114300" distR="114300" simplePos="0" relativeHeight="251659264" behindDoc="0" locked="0" layoutInCell="1" allowOverlap="1" wp14:anchorId="22A5DF50" wp14:editId="774F3F8F">
-            <wp:simplePos x="0" y="0"/>
-            <wp:positionH relativeFrom="margin">
-              <wp:align>right</wp:align>
-            </wp:positionH>
-            <wp:positionV relativeFrom="paragraph">
-              <wp:posOffset>263525</wp:posOffset>
-            </wp:positionV>
-            <wp:extent cx="2606040" cy="1074420"/>
-            <wp:effectExtent l="19050" t="19050" r="22860" b="11430"/>
-            <wp:wrapSquare wrapText="bothSides"/>
-            <wp:docPr id="28" name="Imagem 28" descr="Exemplo de quebra de texto ao redor de uma imagem"/>
-            <wp:cNvGraphicFramePr>
-              <a:graphicFrameLocks xmlns:a="http://schemas.openxmlformats.org/drawingml/2006/main" noChangeAspect="1"/>
-            </wp:cNvGraphicFramePr>
-            <a:graphic xmlns:a="http://schemas.openxmlformats.org/drawingml/2006/main">
-              <a:graphicData uri="http://schemas.openxmlformats.org/drawingml/2006/picture">
-                <pic:pic xmlns:pic="http://schemas.openxmlformats.org/drawingml/2006/picture">
-                  <pic:nvPicPr>
-                    <pic:cNvPr id="1" name=""/>
-                    <pic:cNvPicPr/>
-                  </pic:nvPicPr>
-                  <pic:blipFill>
-                    <a:blip r:embed="rId23"/>
-                    <a:stretch>
-                      <a:fillRect/>
-                    </a:stretch>
-                  </pic:blipFill>
-                  <pic:spPr bwMode="auto">
-                    <a:xfrm>
-                      <a:off x="0" y="0"/>
-                      <a:ext cx="2606040" cy="1074420"/>
-                    </a:xfrm>
-                    <a:prstGeom prst="rect">
-                      <a:avLst/>
-                    </a:prstGeom>
-                    <a:ln w="3175" cap="flat" cmpd="sng" algn="ctr">
-                      <a:solidFill>
-                        <a:schemeClr val="accent1">
-                          <a:lumMod val="50000"/>
-                        </a:schemeClr>
-                      </a:solidFill>
-                      <a:prstDash val="solid"/>
-                      <a:round/>
-                      <a:headEnd type="none" w="med" len="med"/>
-                      <a:tailEnd type="none" w="med" len="med"/>
-                    </a:ln>
-                    <a:extLst>
-                      <a:ext uri="{53640926-AAD7-44D8-BBD7-CCE9431645EC}">
-                        <a14:shadowObscured xmlns:a14="http://schemas.microsoft.com/office/drawing/2010/main"/>
-                      </a:ext>
-                    </a:extLst>
-                  </pic:spPr>
-                </pic:pic>
-              </a:graphicData>
-            </a:graphic>
-            <wp14:sizeRelH relativeFrom="margin">
-              <wp14:pctWidth>0</wp14:pctWidth>
-            </wp14:sizeRelH>
-            <wp14:sizeRelV relativeFrom="margin">
-              <wp14:pctHeight>0</wp14:pctHeight>
-            </wp14:sizeRelV>
-          </wp:anchor>
-        </w:drawing>
-      </w:r>
-      <w:r>
-        <w:rPr>
-          <w:noProof/>
-          <w:lang w:val="pt-BR" w:bidi="pt-BR"/>
-        </w:rPr>
-        <w:t xml:space="preserve">Algumas das imagens neste documento estão colocadas ao lado de um parágrafo de texto. Experimente explorar a quebra de texto: selecione a imagem aqui, vá para </w:t>
-      </w:r>
-      <w:r>
-        <w:rPr>
-          <w:rStyle w:val="Forte"/>
-          <w:noProof/>
-          <w:lang w:val="pt-BR" w:bidi="pt-BR"/>
-        </w:rPr>
-        <w:t>Formatar</w:t>
-      </w:r>
-      <w:r>
-        <w:rPr>
-          <w:noProof/>
-          <w:lang w:val="pt-BR" w:bidi="pt-BR"/>
-        </w:rPr>
-        <w:t xml:space="preserve"> &gt; </w:t>
-      </w:r>
-      <w:r>
-        <w:rPr>
-          <w:rStyle w:val="Forte"/>
-          <w:noProof/>
-          <w:lang w:val="pt-BR" w:bidi="pt-BR"/>
-        </w:rPr>
-        <w:t xml:space="preserve">Quebrar </w:t>
-      </w:r>
-      <w:r>
-        <w:rPr>
-          <w:rStyle w:val="Forte"/>
-          <w:noProof/>
-          <w:lang w:val="pt-BR" w:bidi="pt-BR"/>
-        </w:rPr>
-        <w:t xml:space="preserve">de </w:t>
-      </w:r>
-      <w:r>
-        <w:rPr>
-          <w:rStyle w:val="Forte"/>
-          <w:noProof/>
-          <w:lang w:val="pt-BR" w:bidi="pt-BR"/>
-        </w:rPr>
-        <w:t>Texto</w:t>
-      </w:r>
-      <w:r>
-        <w:rPr>
-          <w:rStyle w:val="Forte"/>
-          <w:noProof/>
-          <w:lang w:val="pt-BR" w:bidi="pt-BR"/>
-        </w:rPr>
-        <w:t xml:space="preserve"> Autom</w:t>
-      </w:r>
-      <w:r>
-        <w:rPr>
-          <w:rStyle w:val="Forte"/>
-          <w:noProof/>
-          <w:lang w:val="pt-BR" w:bidi="pt-BR"/>
-        </w:rPr>
-        <w:t>á</w:t>
-      </w:r>
-      <w:r>
-        <w:rPr>
-          <w:rStyle w:val="Forte"/>
-          <w:noProof/>
-          <w:lang w:val="pt-BR" w:bidi="pt-BR"/>
-        </w:rPr>
-        <w:t>tica</w:t>
-      </w:r>
-      <w:r>
-        <w:rPr>
-          <w:noProof/>
-          <w:lang w:val="pt-BR" w:bidi="pt-BR"/>
-        </w:rPr>
-        <w:t xml:space="preserve"> e use as teclas de direção para cima/baixo para navegar pelas opções e visualizar os resultados.</w:t>
-      </w:r>
-    </w:p>
-    <w:p>
-      <w:pPr>
-        <w:pStyle w:val="Ttulo1QuebradePgina"/>
-        <w:rPr>
-          <w:noProof/>
-          <w:lang w:val="pt-BR"/>
-        </w:rPr>
-      </w:pPr>
-      <w:r>
-        <w:rPr>
-          <w:noProof/>
-          <w:lang w:val="pt-BR" w:bidi="pt-BR"/>
-        </w:rPr>
-        <w:lastRenderedPageBreak/>
-        <w:t>Ajuda do Word</w:t>
-      </w:r>
-    </w:p>
-    <w:p>
-      <w:pPr>
-        <w:rPr>
-          <w:noProof/>
-          <w:lang w:val="pt-BR"/>
-        </w:rPr>
-      </w:pPr>
-      <w:r>
-        <w:rPr>
-          <w:rFonts w:ascii="Segoe UI Light" w:eastAsia="Segoe UI Light" w:hAnsi="Segoe UI Light" w:cs="Segoe UI Light"/>
-          <w:noProof/>
-          <w:color w:val="363636"/>
-          <w:lang w:val="pt-BR" w:bidi="pt-BR"/>
-        </w:rPr>
-        <w:drawing>
-          <wp:inline distT="0" distB="0" distL="0" distR="0" wp14:anchorId="2BC75C63" wp14:editId="4F08DEF4">
-            <wp:extent cx="2039112" cy="1365423"/>
-            <wp:effectExtent l="19050" t="19050" r="18415" b="25400"/>
-            <wp:docPr id="16" name="Imagem 16" descr="Exemplo de caixa de pesquisa Obter Ajuda"/>
-            <wp:cNvGraphicFramePr>
-              <a:graphicFrameLocks xmlns:a="http://schemas.openxmlformats.org/drawingml/2006/main" noChangeAspect="1"/>
-            </wp:cNvGraphicFramePr>
-            <a:graphic xmlns:a="http://schemas.openxmlformats.org/drawingml/2006/main">
-              <a:graphicData uri="http://schemas.openxmlformats.org/drawingml/2006/picture">
-                <pic:pic xmlns:pic="http://schemas.openxmlformats.org/drawingml/2006/picture">
-                  <pic:nvPicPr>
-                    <pic:cNvPr id="0" name="Imagem 32" descr="Digite sua tarefa desejada na caixa Diga-me do Word, e ele ajudará você a realizar a tarefa"/>
-                    <pic:cNvPicPr>
-                      <a:picLocks noChangeAspect="1" noChangeArrowheads="1"/>
-                    </pic:cNvPicPr>
-                  </pic:nvPicPr>
-                  <pic:blipFill>
-                    <a:blip r:embed="rId24"/>
-                    <a:stretch>
-                      <a:fillRect/>
-                    </a:stretch>
-                  </pic:blipFill>
-                  <pic:spPr bwMode="auto">
-                    <a:xfrm>
-                      <a:off x="0" y="0"/>
-                      <a:ext cx="2039112" cy="1365423"/>
-                    </a:xfrm>
-                    <a:prstGeom prst="rect">
-                      <a:avLst/>
-                    </a:prstGeom>
-                    <a:noFill/>
-                    <a:ln w="3175">
-                      <a:solidFill>
-                        <a:schemeClr val="accent1">
-                          <a:lumMod val="50000"/>
-                        </a:schemeClr>
-                      </a:solidFill>
-                    </a:ln>
-                  </pic:spPr>
-                </pic:pic>
-              </a:graphicData>
-            </a:graphic>
-          </wp:inline>
-        </w:drawing>
-      </w:r>
-    </w:p>
-    <w:p>
-      <w:pPr>
-        <w:rPr>
-          <w:noProof/>
-          <w:lang w:val="pt-BR"/>
-        </w:rPr>
-      </w:pPr>
-      <w:r>
-        <w:rPr>
-          <w:noProof/>
-          <w:lang w:val="pt-BR" w:bidi="pt-BR"/>
-        </w:rPr>
-        <w:t xml:space="preserve">A caixa de pesquisa </w:t>
-      </w:r>
-      <w:r>
-        <w:rPr>
-          <w:rStyle w:val="Forte"/>
-          <w:noProof/>
-          <w:lang w:val="pt-BR" w:bidi="pt-BR"/>
-        </w:rPr>
-        <w:t>Diga-me</w:t>
-      </w:r>
-      <w:r>
-        <w:rPr>
-          <w:noProof/>
-          <w:lang w:val="pt-BR" w:bidi="pt-BR"/>
-        </w:rPr>
-        <w:t xml:space="preserve"> levará você direto para os comandos e para a Ajuda no Word.</w:t>
-      </w:r>
-    </w:p>
-    <w:p>
-      <w:pPr>
-        <w:rPr>
-          <w:noProof/>
-          <w:lang w:val="pt-BR"/>
-        </w:rPr>
-      </w:pPr>
-      <w:r>
-        <w:rPr>
-          <w:rStyle w:val="nfase"/>
-          <w:noProof/>
-          <w:lang w:val="pt-BR" w:bidi="pt-BR"/>
-        </w:rPr>
-        <w:t>Experimente:</w:t>
-      </w:r>
-      <w:r>
-        <w:rPr>
-          <w:noProof/>
-          <w:lang w:val="pt-BR" w:bidi="pt-BR"/>
-        </w:rPr>
-        <w:t xml:space="preserve"> para obter ajuda:</w:t>
-      </w:r>
-    </w:p>
-    <w:p>
-      <w:pPr>
-        <w:pStyle w:val="Numerada"/>
-        <w:numPr>
-          <w:ilvl w:val="0"/>
-          <w:numId w:val="10"/>
-        </w:numPr>
-        <w:rPr>
-          <w:noProof/>
-          <w:lang w:val="pt-BR"/>
-        </w:rPr>
-      </w:pPr>
-      <w:r>
-        <w:rPr>
-          <w:noProof/>
-          <w:lang w:val="pt-BR" w:bidi="pt-BR"/>
-        </w:rPr>
-        <w:t xml:space="preserve">Vá para </w:t>
-      </w:r>
-      <w:r>
-        <w:rPr>
-          <w:rStyle w:val="Forte"/>
-          <w:noProof/>
-          <w:lang w:val="pt-BR" w:bidi="pt-BR"/>
-        </w:rPr>
-        <w:t>Pesquisar</w:t>
-      </w:r>
-      <w:r>
-        <w:rPr>
-          <w:noProof/>
-          <w:lang w:val="pt-BR" w:bidi="pt-BR"/>
-        </w:rPr>
-        <w:t xml:space="preserve"> na parte superior da janela.</w:t>
-      </w:r>
-    </w:p>
-    <w:p>
-      <w:pPr>
-        <w:pStyle w:val="Numerada"/>
-        <w:rPr>
-          <w:noProof/>
-          <w:lang w:val="pt-BR"/>
-        </w:rPr>
-      </w:pPr>
-      <w:r>
-        <w:rPr>
-          <w:noProof/>
-          <w:lang w:val="pt-BR" w:bidi="pt-BR"/>
-        </w:rPr>
-        <w:t>Digite o que você deseja fazer.</w:t>
-      </w:r>
-    </w:p>
-    <w:p>
-      <w:pPr>
-        <w:rPr>
-          <w:noProof/>
-          <w:lang w:val="pt-BR"/>
-        </w:rPr>
-      </w:pPr>
-      <w:r>
-        <w:rPr>
-          <w:noProof/>
-          <w:lang w:val="pt-BR" w:bidi="pt-BR"/>
-        </w:rPr>
-        <w:t>Por exemplo, digite:</w:t>
-      </w:r>
-    </w:p>
-    <w:p>
-      <w:pPr>
-        <w:pStyle w:val="Commarcadores"/>
-        <w:rPr>
-          <w:noProof/>
-          <w:lang w:val="pt-BR"/>
-        </w:rPr>
-      </w:pPr>
-      <w:r>
-        <w:rPr>
-          <w:rStyle w:val="Forte"/>
-          <w:noProof/>
-          <w:lang w:val="pt-BR" w:bidi="pt-BR"/>
-        </w:rPr>
-        <w:t>Adicionar marca-d’água</w:t>
-      </w:r>
-      <w:r>
-        <w:rPr>
-          <w:noProof/>
-          <w:lang w:val="pt-BR" w:bidi="pt-BR"/>
-        </w:rPr>
-        <w:t xml:space="preserve"> para ter acesso rápido ao comando de marca d’água.</w:t>
-      </w:r>
-    </w:p>
-    <w:p>
-      <w:pPr>
-        <w:pStyle w:val="Commarcadores"/>
-        <w:rPr>
-          <w:noProof/>
-          <w:lang w:val="pt-BR"/>
-        </w:rPr>
-      </w:pPr>
-      <w:r>
-        <w:rPr>
-          <w:rStyle w:val="Forte"/>
-          <w:noProof/>
-          <w:lang w:val="pt-BR" w:bidi="pt-BR"/>
-        </w:rPr>
-        <w:t>Ajuda</w:t>
-      </w:r>
-      <w:r>
-        <w:rPr>
-          <w:noProof/>
-          <w:lang w:val="pt-BR" w:bidi="pt-BR"/>
-        </w:rPr>
-        <w:t xml:space="preserve"> para acessar a ajuda do Word.</w:t>
-      </w:r>
-    </w:p>
-    <w:p>
-      <w:pPr>
-        <w:pStyle w:val="Commarcadores"/>
-        <w:rPr>
-          <w:noProof/>
-          <w:lang w:val="pt-BR"/>
-        </w:rPr>
-      </w:pPr>
-      <w:r>
-        <w:rPr>
-          <w:rStyle w:val="Forte"/>
-          <w:noProof/>
-          <w:lang w:val="pt-BR" w:bidi="pt-BR"/>
-        </w:rPr>
-        <w:t>Treinamento</w:t>
-      </w:r>
-      <w:r>
-        <w:rPr>
-          <w:noProof/>
-          <w:lang w:val="pt-BR" w:bidi="pt-BR"/>
-        </w:rPr>
-        <w:t xml:space="preserve"> para ver a lista de cursos de treinamento do Word.</w:t>
-      </w:r>
-    </w:p>
-    <w:p>
-      <w:pPr>
-        <w:pStyle w:val="Commarcadores"/>
-        <w:rPr>
-          <w:noProof/>
-          <w:lang w:val="pt-BR"/>
-        </w:rPr>
-      </w:pPr>
-      <w:r>
-        <w:rPr>
-          <w:rStyle w:val="Forte"/>
-          <w:noProof/>
-          <w:lang w:val="pt-BR" w:bidi="pt-BR"/>
-        </w:rPr>
-        <w:t>Novidades</w:t>
-      </w:r>
-      <w:r>
-        <w:rPr>
-          <w:noProof/>
-          <w:lang w:val="pt-BR" w:bidi="pt-BR"/>
-        </w:rPr>
-        <w:t xml:space="preserve"> para ver uma lista com as atualizações mais recentes do Word</w:t>
-      </w:r>
-    </w:p>
-    <w:p>
-      <w:pPr>
-        <w:pStyle w:val="Ttulo1"/>
-        <w:rPr>
-          <w:noProof/>
-          <w:lang w:val="pt-BR"/>
-        </w:rPr>
-      </w:pPr>
-      <w:r>
-        <w:rPr>
-          <w:noProof/>
-          <w:lang w:val="pt-BR" w:bidi="pt-BR"/>
-        </w:rPr>
-        <w:t>Compartilhe sua opinião</w:t>
-      </w:r>
-    </w:p>
-    <w:p>
-      <w:pPr>
-        <w:rPr>
-          <w:noProof/>
-          <w:lang w:val="pt-BR"/>
-        </w:rPr>
-      </w:pPr>
-      <w:hyperlink r:id="rId25" w:tooltip="envie comentários sobre este tour" w:history="1">
-        <w:r>
-          <w:rPr>
-            <w:rStyle w:val="Hyperlink"/>
-            <w:noProof/>
-            <w:lang w:val="pt-BR" w:bidi="pt-BR"/>
-          </w:rPr>
-          <w:t>Envie seus comentários sobre este modelo</w:t>
-        </w:r>
-      </w:hyperlink>
-      <w:r>
-        <w:rPr>
-          <w:noProof/>
-          <w:lang w:val="pt-BR" w:bidi="pt-BR"/>
-        </w:rPr>
-        <w:t xml:space="preserve"> para que possamos fornecer um conteúdo realmente útil. Obrigado!</w:t>
-      </w:r>
-    </w:p>
-    <w:p>
-      <w:pPr>
-        <w:pStyle w:val="Imagem"/>
-        <w:rPr>
-          <w:noProof/>
-          <w:lang w:val="pt-BR"/>
-        </w:rPr>
-      </w:pPr>
-      <w:r>
-        <w:rPr>
-          <w:noProof/>
-          <w:lang w:val="pt-BR" w:bidi="pt-BR"/>
-        </w:rPr>
-        <w:drawing>
-          <wp:inline distT="0" distB="0" distL="0" distR="0" wp14:anchorId="413D4FCE" wp14:editId="74C5DE9D">
-            <wp:extent cx="1247775" cy="1247775"/>
-            <wp:effectExtent l="0" t="0" r="9525" b="9525"/>
-            <wp:docPr id="3" name="Imagem 3" descr="Código QRC">
-              <a:hlinkClick xmlns:a="http://schemas.openxmlformats.org/drawingml/2006/main" r:id="rId26" tooltip="QR code"/>
-            </wp:docPr>
-            <wp:cNvGraphicFramePr>
-              <a:graphicFrameLocks xmlns:a="http://schemas.openxmlformats.org/drawingml/2006/main" noChangeAspect="1"/>
-            </wp:cNvGraphicFramePr>
-            <a:graphic xmlns:a="http://schemas.openxmlformats.org/drawingml/2006/main">
-              <a:graphicData uri="http://schemas.openxmlformats.org/drawingml/2006/picture">
-                <pic:pic xmlns:pic="http://schemas.openxmlformats.org/drawingml/2006/picture">
-                  <pic:nvPicPr>
-                    <pic:cNvPr id="3" name="Imagem 3" descr="Código QRC">
-                      <a:hlinkClick r:id="rId26" tooltip="QR code"/>
-                    </pic:cNvPr>
-                    <pic:cNvPicPr/>
-                  </pic:nvPicPr>
-                  <pic:blipFill>
-                    <a:blip r:embed="rId27">
-                      <a:extLst>
-                        <a:ext uri="{28A0092B-C50C-407E-A947-70E740481C1C}">
-                          <a14:useLocalDpi xmlns:a14="http://schemas.microsoft.com/office/drawing/2010/main" val="0"/>
-                        </a:ext>
-                      </a:extLst>
-                    </a:blip>
-                    <a:stretch>
-                      <a:fillRect/>
-                    </a:stretch>
-                  </pic:blipFill>
-                  <pic:spPr>
-                    <a:xfrm>
-                      <a:off x="0" y="0"/>
-                      <a:ext cx="1247775" cy="1247775"/>
-                    </a:xfrm>
-                    <a:prstGeom prst="rect">
-                      <a:avLst/>
-                    </a:prstGeom>
-                  </pic:spPr>
-                </pic:pic>
-              </a:graphicData>
-            </a:graphic>
-          </wp:inline>
-        </w:drawing>
       </w:r>
     </w:p>
     <w:sectPr>
@@ -7691,6 +5396,7 @@
   <w:style w:type="character" w:default="1" w:styleId="Fontepargpadro">
     <w:name w:val="Default Paragraph Font"/>
     <w:uiPriority w:val="1"/>
+    <w:semiHidden/>
     <w:unhideWhenUsed/>
   </w:style>
   <w:style w:type="table" w:default="1" w:styleId="Tabelanormal">
@@ -32638,21 +30344,21 @@
 </file>
 
 <file path=customXml/item1.xml><?xml version="1.0" encoding="utf-8"?>
+<p:properties xmlns:p="http://schemas.microsoft.com/office/2006/metadata/properties" xmlns:xsi="http://www.w3.org/2001/XMLSchema-instance" xmlns:pc="http://schemas.microsoft.com/office/infopath/2007/PartnerControls">
+  <documentManagement>
+    <Status xmlns="71af3243-3dd4-4a8d-8c0d-dd76da1f02a5">Not started</Status>
+    <MediaServiceKeyPoints xmlns="71af3243-3dd4-4a8d-8c0d-dd76da1f02a5" xsi:nil="true"/>
+  </documentManagement>
+</p:properties>
+</file>
+
+<file path=customXml/item2.xml><?xml version="1.0" encoding="utf-8"?>
 <?mso-contentType ?>
 <FormTemplates xmlns="http://schemas.microsoft.com/sharepoint/v3/contenttype/forms">
   <Display>DocumentLibraryForm</Display>
   <Edit>DocumentLibraryForm</Edit>
   <New>DocumentLibraryForm</New>
 </FormTemplates>
-</file>
-
-<file path=customXml/item2.xml><?xml version="1.0" encoding="utf-8"?>
-<p:properties xmlns:p="http://schemas.microsoft.com/office/2006/metadata/properties" xmlns:xsi="http://www.w3.org/2001/XMLSchema-instance" xmlns:pc="http://schemas.microsoft.com/office/infopath/2007/PartnerControls">
-  <documentManagement>
-    <Status xmlns="71af3243-3dd4-4a8d-8c0d-dd76da1f02a5">Not started</Status>
-    <MediaServiceKeyPoints xmlns="71af3243-3dd4-4a8d-8c0d-dd76da1f02a5" xsi:nil="true"/>
-  </documentManagement>
-</p:properties>
 </file>
 
 <file path=customXml/item3.xml><?xml version="1.0" encoding="utf-8"?>
@@ -32877,19 +30583,19 @@
 </file>
 
 <file path=customXml/itemProps1.xml><?xml version="1.0" encoding="utf-8"?>
-<ds:datastoreItem xmlns:ds="http://schemas.openxmlformats.org/officeDocument/2006/customXml" ds:itemID="{7B9FE982-DDF9-4F2B-80C6-E4D44711D042}">
+<ds:datastoreItem xmlns:ds="http://schemas.openxmlformats.org/officeDocument/2006/customXml" ds:itemID="{4CF6AFD9-3CE3-4EEA-B705-82EE1111B485}">
   <ds:schemaRefs>
-    <ds:schemaRef ds:uri="http://schemas.microsoft.com/sharepoint/v3/contenttype/forms"/>
+    <ds:schemaRef ds:uri="http://schemas.microsoft.com/office/2006/metadata/properties"/>
+    <ds:schemaRef ds:uri="http://schemas.microsoft.com/office/infopath/2007/PartnerControls"/>
+    <ds:schemaRef ds:uri="71af3243-3dd4-4a8d-8c0d-dd76da1f02a5"/>
   </ds:schemaRefs>
 </ds:datastoreItem>
 </file>
 
 <file path=customXml/itemProps2.xml><?xml version="1.0" encoding="utf-8"?>
-<ds:datastoreItem xmlns:ds="http://schemas.openxmlformats.org/officeDocument/2006/customXml" ds:itemID="{4CF6AFD9-3CE3-4EEA-B705-82EE1111B485}">
+<ds:datastoreItem xmlns:ds="http://schemas.openxmlformats.org/officeDocument/2006/customXml" ds:itemID="{7B9FE982-DDF9-4F2B-80C6-E4D44711D042}">
   <ds:schemaRefs>
-    <ds:schemaRef ds:uri="http://schemas.microsoft.com/office/2006/metadata/properties"/>
-    <ds:schemaRef ds:uri="http://schemas.microsoft.com/office/infopath/2007/PartnerControls"/>
-    <ds:schemaRef ds:uri="71af3243-3dd4-4a8d-8c0d-dd76da1f02a5"/>
+    <ds:schemaRef ds:uri="http://schemas.microsoft.com/sharepoint/v3/contenttype/forms"/>
   </ds:schemaRefs>
 </ds:datastoreItem>
 </file>

</xml_diff>